<commit_message>
Prompt de tradução ED: fazendeiro → farmer
Co-Authored-By: Claude Fable 5.1 <noreply@anthropic.com>
Claude-Session: https://claude.ai/code/session_017HYp1xhSzB6Ui5hyJvLbGE
</commit_message>
<xml_diff>
--- a/analise-ed/PROMPT_Traducao_VSL_ED_EN-US.docx
+++ b/analise-ed/PROMPT_Traducao_VSL_ED_EN-US.docx
@@ -4795,7 +4795,40 @@
               <w:jc w:val="left"/>
             </w:pPr>
             <w:r>
-              <w:t xml:space="preserve">rancher / breeder</w:t>
+              <w:t xml:space="preserve">rancher / breeder (só quando o PT disser</w:t>
+            </w:r>
+            <w:r>
+              <w:t xml:space="preserve"> </w:t>
+            </w:r>
+            <w:r>
+              <w:t xml:space="preserve">“</w:t>
+            </w:r>
+            <w:r>
+              <w:t xml:space="preserve">rancheiro</w:t>
+            </w:r>
+            <w:r>
+              <w:t xml:space="preserve">”</w:t>
+            </w:r>
+            <w:r>
+              <w:t xml:space="preserve"> </w:t>
+            </w:r>
+            <w:r>
+              <w:t xml:space="preserve">ou</w:t>
+            </w:r>
+            <w:r>
+              <w:t xml:space="preserve"> </w:t>
+            </w:r>
+            <w:r>
+              <w:t xml:space="preserve">“</w:t>
+            </w:r>
+            <w:r>
+              <w:t xml:space="preserve">criador</w:t>
+            </w:r>
+            <w:r>
+              <w:t xml:space="preserve">”</w:t>
+            </w:r>
+            <w:r>
+              <w:t xml:space="preserve">)</w:t>
             </w:r>
           </w:p>
         </w:tc>
@@ -4821,7 +4854,7 @@
               <w:jc w:val="left"/>
             </w:pPr>
             <w:r>
-              <w:t xml:space="preserve">rancher (no Texas)</w:t>
+              <w:t xml:space="preserve">farmer (sempre; nunca rancher)</w:t>
             </w:r>
           </w:p>
         </w:tc>
@@ -6001,10 +6034,31 @@
               <w:t xml:space="preserve">“</w:t>
             </w:r>
             <w:r>
-              <w:t xml:space="preserve">the way the ranchers fix it</w:t>
+              <w:t xml:space="preserve">the way the farmers fix it</w:t>
             </w:r>
             <w:r>
               <w:t xml:space="preserve">”</w:t>
+            </w:r>
+            <w:r>
+              <w:t xml:space="preserve"> </w:t>
+            </w:r>
+            <w:r>
+              <w:t xml:space="preserve">(se o PT disser</w:t>
+            </w:r>
+            <w:r>
+              <w:t xml:space="preserve"> </w:t>
+            </w:r>
+            <w:r>
+              <w:t xml:space="preserve">“</w:t>
+            </w:r>
+            <w:r>
+              <w:t xml:space="preserve">fazendeiros</w:t>
+            </w:r>
+            <w:r>
+              <w:t xml:space="preserve">”</w:t>
+            </w:r>
+            <w:r>
+              <w:t xml:space="preserve">)</w:t>
             </w:r>
           </w:p>
         </w:tc>
@@ -7111,7 +7165,7 @@
         <w:t xml:space="preserve"> </w:t>
       </w:r>
       <w:r>
-        <w:t xml:space="preserve">→ rancher. Cock permitido aqui além de dick. Podem usar</w:t>
+        <w:t xml:space="preserve">→ farmer. Cock permitido aqui além de dick. Podem usar</w:t>
       </w:r>
       <w:r>
         <w:t xml:space="preserve"> </w:t>

</xml_diff>

<commit_message>
Prompt de tradução ED: entrega apenas EN-US (remove artifact PT-BR limpa)
Co-Authored-By: Claude Fable 5.1 <noreply@anthropic.com>
Claude-Session: https://claude.ai/code/session_017HYp1xhSzB6Ui5hyJvLbGE
</commit_message>
<xml_diff>
--- a/analise-ed/PROMPT_Traducao_VSL_ED_EN-US.docx
+++ b/analise-ed/PROMPT_Traducao_VSL_ED_EN-US.docx
@@ -2,7 +2,7 @@
 <file path=word/document.xml><?xml version="1.0" encoding="utf-8"?>
 <w:document xmlns:w="http://schemas.openxmlformats.org/wordprocessingml/2006/main" xmlns:m="http://schemas.openxmlformats.org/officeDocument/2006/math" xmlns:r="http://schemas.openxmlformats.org/officeDocument/2006/relationships" xmlns:o="urn:schemas-microsoft-com:office:office" xmlns:v="urn:schemas-microsoft-com:vml" xmlns:w10="urn:schemas-microsoft-com:office:word" xmlns:a="http://schemas.openxmlformats.org/drawingml/2006/main" xmlns:pic="http://schemas.openxmlformats.org/drawingml/2006/picture" xmlns:wp="http://schemas.openxmlformats.org/drawingml/2006/wordprocessingDrawing">
   <w:body>
-    <w:bookmarkStart w:id="53" w:name="Xe16377c1673167565b6e295c4c38267bf038cc1"/>
+    <w:bookmarkStart w:id="52" w:name="Xe16377c1673167565b6e295c4c38267bf038cc1"/>
     <w:p>
       <w:pPr>
         <w:pStyle w:val="Heading1"/>
@@ -270,18 +270,6 @@
         <w:t xml:space="preserve">, fiel.</w:t>
       </w:r>
     </w:p>
-    <w:p>
-      <w:pPr>
-        <w:numPr>
-          <w:ilvl w:val="0"/>
-          <w:numId w:val="1001"/>
-        </w:numPr>
-        <w:pStyle w:val="Compact"/>
-      </w:pPr>
-      <w:r>
-        <w:t xml:space="preserve">A mesma fidelidade vale para a versão PT-BR limpa (Parte 2): nada reescrito, nada corrigido, só sem o andaime de produção.</w:t>
-      </w:r>
-    </w:p>
     <w:bookmarkEnd w:id="21"/>
     <w:bookmarkStart w:id="24" w:name="o-que-entra-na-saída-limpeza-obrigatória"/>
     <w:p>
@@ -297,7 +285,7 @@
         <w:pStyle w:val="FirstParagraph"/>
       </w:pPr>
       <w:r>
-        <w:t xml:space="preserve">A saída contém só o que o avatar ouve ou lê na tela + a tag de personagem. O resto é andaime e sai dos dois artifacts.</w:t>
+        <w:t xml:space="preserve">A saída contém só o que o avatar ouve ou lê na tela + a tag de personagem. O resto é andaime e sai do artifact.</w:t>
       </w:r>
     </w:p>
     <w:p>
@@ -423,7 +411,7 @@
           <w:bCs/>
           <w:b/>
         </w:rPr>
-        <w:t xml:space="preserve">nos dois artifacts, em PT-BR, sem traduzir e sem mexer</w:t>
+        <w:t xml:space="preserve">no artifact EN-US, em PT-BR, sem traduzir e sem mexer</w:t>
       </w:r>
       <w:r>
         <w:t xml:space="preserve">, na mesma posição. Elas são instrução pro editor, não copy. Fora do modo roteiro, saem.</w:t>
@@ -450,7 +438,7 @@
         <w:t xml:space="preserve"> </w:t>
       </w:r>
       <w:r>
-        <w:t xml:space="preserve">- Nomes próprios reais (Dr. Andrew Huberman, Mike Tyson, Lakiha, Julia Ann, Cory Chase, Sydney Sweeney, Kevin Costner, Sylvester Stallone, Johnny Sins, Robert F. Kennedy Jr., David Hartman): grafia original nos dois artifacts.</w:t>
+        <w:t xml:space="preserve">- Nomes próprios reais (Dr. Andrew Huberman, Mike Tyson, Lakiha, Julia Ann, Cory Chase, Sydney Sweeney, Kevin Costner, Sylvester Stallone, Johnny Sins, Robert F. Kennedy Jr., David Hartman): grafia original.</w:t>
       </w:r>
       <w:r>
         <w:t xml:space="preserve"> </w:t>
@@ -514,13 +502,13 @@
       </w:r>
     </w:p>
     <w:bookmarkEnd w:id="22"/>
-    <w:bookmarkStart w:id="23" w:name="paralelismo-pt-br-limpa-en-us"/>
+    <w:bookmarkStart w:id="23" w:name="paralelismo-com-o-original"/>
     <w:p>
       <w:pPr>
         <w:pStyle w:val="Heading3"/>
       </w:pPr>
       <w:r>
-        <w:t xml:space="preserve">3.2 Paralelismo PT-BR limpa × EN-US</w:t>
+        <w:t xml:space="preserve">3.2 Paralelismo com o original</w:t>
       </w:r>
     </w:p>
     <w:p>
@@ -528,7 +516,7 @@
         <w:pStyle w:val="FirstParagraph"/>
       </w:pPr>
       <w:r>
-        <w:t xml:space="preserve">Os dois artifacts são idênticos em estrutura: mesmas tags na mesma posição, mesmo número de parágrafos, mesmas aspas, mesmas listas, mesma formatação. Colados lado a lado no Google Docs, parágrafo n bate com parágrafo n.</w:t>
+        <w:t xml:space="preserve">O artifact EN-US espelha a estrutura do PT enviado: mesmas tags na mesma posição, mesmo número de parágrafos, mesmas aspas, mesmas listas, mesma formatação. Colado ao lado do original no Google Docs, parágrafo n bate com parágrafo n.</w:t>
       </w:r>
     </w:p>
     <w:bookmarkEnd w:id="23"/>
@@ -7459,22 +7447,40 @@
       </w:r>
     </w:p>
     <w:bookmarkEnd w:id="44"/>
-    <w:bookmarkStart w:id="48" w:name="saída"/>
+    <w:bookmarkStart w:id="47" w:name="saída-apenas-en-us"/>
     <w:p>
       <w:pPr>
         <w:pStyle w:val="Heading2"/>
       </w:pPr>
       <w:r>
-        <w:t xml:space="preserve">10. SAÍDA</w:t>
+        <w:t xml:space="preserve">10. SAÍDA (apenas EN-US)</w:t>
       </w:r>
     </w:p>
-    <w:bookmarkStart w:id="45" w:name="parte-1-copy-en-us-em-artifact-markdown"/>
     <w:p>
       <w:pPr>
+        <w:pStyle w:val="FirstParagraph"/>
+      </w:pPr>
+      <w:r>
+        <w:rPr>
+          <w:bCs/>
+          <w:b/>
+        </w:rPr>
+        <w:t xml:space="preserve">Não entregue versão PT-BR.</w:t>
+      </w:r>
+      <w:r>
+        <w:t xml:space="preserve"> </w:t>
+      </w:r>
+      <w:r>
+        <w:t xml:space="preserve">Nenhuma cópia limpa, nenhum espelho, nenhuma tradução de volta. A entrega é um único artifact em inglês mais o relatório no chat.</w:t>
+      </w:r>
+    </w:p>
+    <w:bookmarkStart w:id="45" w:name="Xd4e38d744fa08c013c64e2e58b8862a56ea8282"/>
+    <w:p>
+      <w:pPr>
         <w:pStyle w:val="Heading3"/>
       </w:pPr>
       <w:r>
-        <w:t xml:space="preserve">PARTE 1 — COPY EN-US · em ARTIFACT (markdown)</w:t>
+        <w:t xml:space="preserve">PARTE 1 — COPY EN-US · em ARTIFACT (markdown) · a única entrega de copy</w:t>
       </w:r>
     </w:p>
     <w:p>
@@ -7498,43 +7504,13 @@
       </w:r>
     </w:p>
     <w:bookmarkEnd w:id="45"/>
-    <w:bookmarkStart w:id="46" w:name="X64b66b2672cd07c0dc9f6e612427cd6d0a01c57"/>
+    <w:bookmarkStart w:id="46" w:name="X65a888372ebc6bf5d0eceeabbd46e02a305be2e"/>
     <w:p>
       <w:pPr>
         <w:pStyle w:val="Heading3"/>
       </w:pPr>
       <w:r>
-        <w:t xml:space="preserve">PARTE 2 — COPY PT-BR LIMPA · em ARTIFACT (markdown)</w:t>
-      </w:r>
-    </w:p>
-    <w:p>
-      <w:pPr>
-        <w:pStyle w:val="FirstParagraph"/>
-      </w:pPr>
-      <w:r>
-        <w:t xml:space="preserve">Espelho do original com as mesmas regras de limpeza. Texto exatamente como o usuário mandou, typos incluídos. Mesma estrutura e mesmas tags da Parte 1. Título:</w:t>
-      </w:r>
-      <w:r>
-        <w:t xml:space="preserve"> </w:t>
-      </w:r>
-      <w:r>
-        <w:rPr>
-          <w:rStyle w:val="VerbatimChar"/>
-        </w:rPr>
-        <w:t xml:space="preserve">Copy VSL PT-BR (limpa) — [mesmo identificador]</w:t>
-      </w:r>
-      <w:r>
-        <w:t xml:space="preserve">.</w:t>
-      </w:r>
-    </w:p>
-    <w:bookmarkEnd w:id="46"/>
-    <w:bookmarkStart w:id="47" w:name="X3b2eac0309c3110bbf27a7e5bfd4732284f4a8a"/>
-    <w:p>
-      <w:pPr>
-        <w:pStyle w:val="Heading3"/>
-      </w:pPr>
-      <w:r>
-        <w:t xml:space="preserve">PARTE 3 — RELATÓRIO DE ADAPTAÇÕES · no chat, em PT-BR</w:t>
+        <w:t xml:space="preserve">PARTE 2 — RELATÓRIO DE ADAPTAÇÕES · no chat, em PT-BR</w:t>
       </w:r>
     </w:p>
     <w:p>
@@ -7554,7 +7530,7 @@
         <w:rPr>
           <w:rStyle w:val="VerbatimChar"/>
         </w:rPr>
-        <w:t xml:space="preserve">Nicho: ED (fixo)</w:t>
+        <w:t xml:space="preserve">Nicho: ED (fixo) · Entrega: só EN-US</w:t>
       </w:r>
       <w:r>
         <w:br/>
@@ -7671,9 +7647,9 @@
         <w:t xml:space="preserve">- (se não houver: "Nenhum.")</w:t>
       </w:r>
     </w:p>
+    <w:bookmarkEnd w:id="46"/>
     <w:bookmarkEnd w:id="47"/>
-    <w:bookmarkEnd w:id="48"/>
-    <w:bookmarkStart w:id="49" w:name="typos-ocr-e-ambiguidades"/>
+    <w:bookmarkStart w:id="48" w:name="typos-ocr-e-ambiguidades"/>
     <w:p>
       <w:pPr>
         <w:pStyle w:val="Heading2"/>
@@ -7687,7 +7663,7 @@
         <w:pStyle w:val="FirstParagraph"/>
       </w:pPr>
       <w:r>
-        <w:t xml:space="preserve">Typo óbvio no PT: traduza pelo sentido na Parte 1, mantenha na Parte 2, liste na Parte 3. Ambiguidade sexual (ex.:</w:t>
+        <w:t xml:space="preserve">Typo óbvio no PT: traduza pelo sentido na Parte 1 e liste na Parte 2. Ambiguidade sexual (ex.:</w:t>
       </w:r>
       <w:r>
         <w:t xml:space="preserve"> </w:t>
@@ -7741,8 +7717,8 @@
         <w:t xml:space="preserve">): escolha a leitura mais crua se o contexto for sexual, e sinalize a alternativa no relatório.</w:t>
       </w:r>
     </w:p>
-    <w:bookmarkEnd w:id="49"/>
-    <w:bookmarkStart w:id="50" w:name="consistência-entre-rodadas"/>
+    <w:bookmarkEnd w:id="48"/>
+    <w:bookmarkStart w:id="49" w:name="consistência-entre-rodadas"/>
     <w:p>
       <w:pPr>
         <w:pStyle w:val="Heading2"/>
@@ -7756,7 +7732,7 @@
         <w:pStyle w:val="FirstParagraph"/>
       </w:pPr>
       <w:r>
-        <w:t xml:space="preserve">Mesmo glossário, mesma voz por personagem, mesmas frases-âncora, mesmo nome de produto e de truque, mesmos títulos de bônus, mesmo identificador nos artifacts. Mudança pedida pelo usuário vale daquele ponto em diante, com oferta de atualizar as rodadas anteriores.</w:t>
+        <w:t xml:space="preserve">Mesmo glossário, mesma voz por personagem, mesmas frases-âncora, mesmo nome de produto e de truque, mesmos títulos de bônus, mesmo identificador no artifact. Mudança pedida pelo usuário vale daquele ponto em diante, com oferta de atualizar as rodadas anteriores.</w:t>
       </w:r>
       <w:r>
         <w:t xml:space="preserve"> </w:t>
@@ -7862,8 +7838,8 @@
         <w:t xml:space="preserve">, é feita na primeira rodada e nunca muda.</w:t>
       </w:r>
     </w:p>
-    <w:bookmarkEnd w:id="50"/>
-    <w:bookmarkStart w:id="51" w:name="controle-de-tamanho-novo"/>
+    <w:bookmarkEnd w:id="49"/>
+    <w:bookmarkStart w:id="50" w:name="controle-de-tamanho-novo"/>
     <w:p>
       <w:pPr>
         <w:pStyle w:val="Heading2"/>
@@ -7953,11 +7929,11 @@
         <w:t xml:space="preserve">”</w:t>
       </w:r>
       <w:r>
-        <w:t xml:space="preserve">, e dobras de adjetivo. Se sair mais de 15% menor, algo foi cortado: confira frase a frase. Reporte os dois números na Parte 3.</w:t>
+        <w:t xml:space="preserve">, e dobras de adjetivo. Se sair mais de 15% menor, algo foi cortado: confira frase a frase. Reporte os dois números na Parte 2.</w:t>
       </w:r>
     </w:p>
-    <w:bookmarkEnd w:id="51"/>
-    <w:bookmarkStart w:id="52" w:name="checklist-final"/>
+    <w:bookmarkEnd w:id="50"/>
+    <w:bookmarkStart w:id="51" w:name="checklist-final"/>
     <w:p>
       <w:pPr>
         <w:pStyle w:val="Heading2"/>
@@ -7981,7 +7957,7 @@
         <w:t xml:space="preserve"> </w:t>
       </w:r>
       <w:r>
-        <w:t xml:space="preserve">- [ ] Artifact em markdown, só copy + [Personagem] (+ orientações em PT se MODO ROTEIRO)?</w:t>
+        <w:t xml:space="preserve">- [ ] Um único artifact, em inglês, só copy + [Personagem] (+ orientações em PT se MODO ROTEIRO)? Nenhuma versão PT-BR entregue?</w:t>
       </w:r>
       <w:r>
         <w:t xml:space="preserve"> </w:t>
@@ -8077,59 +8053,35 @@
           <w:bCs/>
           <w:b/>
         </w:rPr>
-        <w:t xml:space="preserve">Parte 2 — PT-BR limpa</w:t>
-      </w:r>
-      <w:r>
-        <w:t xml:space="preserve"> </w:t>
-      </w:r>
-      <w:r>
-        <w:t xml:space="preserve">- [ ] Artifact separado, mesma estrutura e mesmas tags da Parte 1?</w:t>
-      </w:r>
-      <w:r>
-        <w:t xml:space="preserve"> </w:t>
-      </w:r>
-      <w:r>
-        <w:t xml:space="preserve">- [ ] Texto fiel ao original, typos preservados, sem andaime?</w:t>
+        <w:t xml:space="preserve">Parte 2 — Relatório</w:t>
+      </w:r>
+      <w:r>
+        <w:t xml:space="preserve"> </w:t>
+      </w:r>
+      <w:r>
+        <w:t xml:space="preserve">- [ ] No chat, em PT-BR, com as cinco seções,</w:t>
+      </w:r>
+      <w:r>
+        <w:t xml:space="preserve"> </w:t>
+      </w:r>
+      <w:r>
+        <w:t xml:space="preserve">“</w:t>
+      </w:r>
+      <w:r>
+        <w:t xml:space="preserve">Nenhum</w:t>
+      </w:r>
+      <w:r>
+        <w:t xml:space="preserve">”</w:t>
+      </w:r>
+      <w:r>
+        <w:t xml:space="preserve"> </w:t>
+      </w:r>
+      <w:r>
+        <w:t xml:space="preserve">onde não houver?</w:t>
       </w:r>
     </w:p>
-    <w:p>
-      <w:pPr>
-        <w:pStyle w:val="BodyText"/>
-      </w:pPr>
-      <w:r>
-        <w:rPr>
-          <w:bCs/>
-          <w:b/>
-        </w:rPr>
-        <w:t xml:space="preserve">Parte 3 — Relatório</w:t>
-      </w:r>
-      <w:r>
-        <w:t xml:space="preserve"> </w:t>
-      </w:r>
-      <w:r>
-        <w:t xml:space="preserve">- [ ] No chat, em PT-BR, com as seis seções,</w:t>
-      </w:r>
-      <w:r>
-        <w:t xml:space="preserve"> </w:t>
-      </w:r>
-      <w:r>
-        <w:t xml:space="preserve">“</w:t>
-      </w:r>
-      <w:r>
-        <w:t xml:space="preserve">Nenhum</w:t>
-      </w:r>
-      <w:r>
-        <w:t xml:space="preserve">”</w:t>
-      </w:r>
-      <w:r>
-        <w:t xml:space="preserve"> </w:t>
-      </w:r>
-      <w:r>
-        <w:t xml:space="preserve">onde não houver?</w:t>
-      </w:r>
-    </w:p>
+    <w:bookmarkEnd w:id="51"/>
     <w:bookmarkEnd w:id="52"/>
-    <w:bookmarkEnd w:id="53"/>
     <w:sectPr/>
   </w:body>
 </w:document>

</xml_diff>

<commit_message>
Prompt de tradução ED: regra de carga igual em cenas sexuais e lista de frases mortas
Co-Authored-By: Claude Fable 5.1 <noreply@anthropic.com>
Claude-Session: https://claude.ai/code/session_017HYp1xhSzB6Ui5hyJvLbGE
</commit_message>
<xml_diff>
--- a/analise-ed/PROMPT_Traducao_VSL_ED_EN-US.docx
+++ b/analise-ed/PROMPT_Traducao_VSL_ED_EN-US.docx
@@ -2,7 +2,7 @@
 <file path=word/document.xml><?xml version="1.0" encoding="utf-8"?>
 <w:document xmlns:w="http://schemas.openxmlformats.org/wordprocessingml/2006/main" xmlns:m="http://schemas.openxmlformats.org/officeDocument/2006/math" xmlns:r="http://schemas.openxmlformats.org/officeDocument/2006/relationships" xmlns:o="urn:schemas-microsoft-com:office:office" xmlns:v="urn:schemas-microsoft-com:vml" xmlns:w10="urn:schemas-microsoft-com:office:word" xmlns:a="http://schemas.openxmlformats.org/drawingml/2006/main" xmlns:pic="http://schemas.openxmlformats.org/drawingml/2006/picture" xmlns:wp="http://schemas.openxmlformats.org/drawingml/2006/wordprocessingDrawing">
   <w:body>
-    <w:bookmarkStart w:id="52" w:name="Xe16377c1673167565b6e295c4c38267bf038cc1"/>
+    <w:bookmarkStart w:id="53" w:name="Xe16377c1673167565b6e295c4c38267bf038cc1"/>
     <w:p>
       <w:pPr>
         <w:pStyle w:val="Heading1"/>
@@ -521,7 +521,7 @@
     </w:p>
     <w:bookmarkEnd w:id="23"/>
     <w:bookmarkEnd w:id="24"/>
-    <w:bookmarkStart w:id="26" w:name="nível-e-registro-de-linguagem-en-us"/>
+    <w:bookmarkStart w:id="27" w:name="nível-e-registro-de-linguagem-en-us"/>
     <w:p>
       <w:pPr>
         <w:pStyle w:val="Heading2"/>
@@ -898,14 +898,13 @@
       </w:r>
     </w:p>
     <w:bookmarkEnd w:id="25"/>
-    <w:bookmarkEnd w:id="26"/>
-    <w:bookmarkStart w:id="27" w:name="nicho-fixo-em-ed"/>
+    <w:bookmarkStart w:id="26" w:name="X09a9a9f354228e243f11e0949bff25769c3072c"/>
     <w:p>
       <w:pPr>
-        <w:pStyle w:val="Heading2"/>
-      </w:pPr>
-      <w:r>
-        <w:t xml:space="preserve">5. NICHO: FIXO EM ED</w:t>
+        <w:pStyle w:val="Heading3"/>
+      </w:pPr>
+      <w:r>
+        <w:t xml:space="preserve">4.2 Carga igual, nunca pra baixo (cenas de sexo, orgasmo, palavrão)</w:t>
       </w:r>
     </w:p>
     <w:p>
@@ -913,17 +912,23 @@
         <w:pStyle w:val="FirstParagraph"/>
       </w:pPr>
       <w:r>
-        <w:t xml:space="preserve">Não há detecção de nicho. Toda copy que entrar neste prompt é de disfunção erétil, aumento e desempenho sexual masculino, com universo de rancho de touros Longhorn no Texas. Aplique a seção 8 inteira, sempre. Se a copy misturar prova de fertilidade, testosterona ou próstata, são sub-temas do mesmo nicho, não nichos à parte.</w:t>
-      </w:r>
-    </w:p>
-    <w:bookmarkEnd w:id="27"/>
-    <w:bookmarkStart w:id="28" w:name="o-que-nunca-alterar"/>
-    <w:p>
-      <w:pPr>
-        <w:pStyle w:val="Heading2"/>
-      </w:pPr>
-      <w:r>
-        <w:t xml:space="preserve">6. O QUE NUNCA ALTERAR</w:t>
+        <w:t xml:space="preserve">A palavra forte em português sai com a</w:t>
+      </w:r>
+      <w:r>
+        <w:t xml:space="preserve"> </w:t>
+      </w:r>
+      <w:r>
+        <w:rPr>
+          <w:bCs/>
+          <w:b/>
+        </w:rPr>
+        <w:t xml:space="preserve">mesma carga</w:t>
+      </w:r>
+      <w:r>
+        <w:t xml:space="preserve"> </w:t>
+      </w:r>
+      <w:r>
+        <w:t xml:space="preserve">em inglês. Uma tradução gramaticalmente certa que perde a força é tradução errada. O inglês tem palavra crua pra tudo que o PT tem; use.</w:t>
       </w:r>
     </w:p>
     <w:p>
@@ -935,6 +940,1126 @@
         <w:pStyle w:val="Compact"/>
       </w:pPr>
       <w:r>
+        <w:rPr>
+          <w:bCs/>
+          <w:b/>
+        </w:rPr>
+        <w:t xml:space="preserve">Orgasmo e gozo.</w:t>
+      </w:r>
+      <w:r>
+        <w:t xml:space="preserve"> </w:t>
+      </w:r>
+      <w:r>
+        <w:t xml:space="preserve">“</w:t>
+      </w:r>
+      <w:r>
+        <w:t xml:space="preserve">Gozei três vezes</w:t>
+      </w:r>
+      <w:r>
+        <w:t xml:space="preserve">”</w:t>
+      </w:r>
+      <w:r>
+        <w:t xml:space="preserve"> </w:t>
+      </w:r>
+      <w:r>
+        <w:t xml:space="preserve">→</w:t>
+      </w:r>
+      <w:r>
+        <w:t xml:space="preserve"> </w:t>
+      </w:r>
+      <w:r>
+        <w:t xml:space="preserve">“</w:t>
+      </w:r>
+      <w:r>
+        <w:t xml:space="preserve">I came three times</w:t>
+      </w:r>
+      <w:r>
+        <w:t xml:space="preserve">”</w:t>
+      </w:r>
+      <w:r>
+        <w:t xml:space="preserve">, nunca</w:t>
+      </w:r>
+      <w:r>
+        <w:t xml:space="preserve"> </w:t>
+      </w:r>
+      <w:r>
+        <w:t xml:space="preserve">“</w:t>
+      </w:r>
+      <w:r>
+        <w:t xml:space="preserve">I climaxed</w:t>
+      </w:r>
+      <w:r>
+        <w:t xml:space="preserve">”</w:t>
+      </w:r>
+      <w:r>
+        <w:t xml:space="preserve"> </w:t>
+      </w:r>
+      <w:r>
+        <w:t xml:space="preserve">/</w:t>
+      </w:r>
+      <w:r>
+        <w:t xml:space="preserve"> </w:t>
+      </w:r>
+      <w:r>
+        <w:t xml:space="preserve">“</w:t>
+      </w:r>
+      <w:r>
+        <w:t xml:space="preserve">I reached orgasm</w:t>
+      </w:r>
+      <w:r>
+        <w:t xml:space="preserve">”</w:t>
+      </w:r>
+      <w:r>
+        <w:t xml:space="preserve"> </w:t>
+      </w:r>
+      <w:r>
+        <w:t xml:space="preserve">/</w:t>
+      </w:r>
+      <w:r>
+        <w:t xml:space="preserve"> </w:t>
+      </w:r>
+      <w:r>
+        <w:t xml:space="preserve">“</w:t>
+      </w:r>
+      <w:r>
+        <w:t xml:space="preserve">I finished</w:t>
+      </w:r>
+      <w:r>
+        <w:t xml:space="preserve">”</w:t>
+      </w:r>
+      <w:r>
+        <w:t xml:space="preserve">.</w:t>
+      </w:r>
+      <w:r>
+        <w:t xml:space="preserve"> </w:t>
+      </w:r>
+      <w:r>
+        <w:t xml:space="preserve">“</w:t>
+      </w:r>
+      <w:r>
+        <w:t xml:space="preserve">Ela gozou gritando</w:t>
+      </w:r>
+      <w:r>
+        <w:t xml:space="preserve">”</w:t>
+      </w:r>
+      <w:r>
+        <w:t xml:space="preserve"> </w:t>
+      </w:r>
+      <w:r>
+        <w:t xml:space="preserve">→</w:t>
+      </w:r>
+      <w:r>
+        <w:t xml:space="preserve"> </w:t>
+      </w:r>
+      <w:r>
+        <w:t xml:space="preserve">“</w:t>
+      </w:r>
+      <w:r>
+        <w:t xml:space="preserve">she came screaming</w:t>
+      </w:r>
+      <w:r>
+        <w:t xml:space="preserve">”</w:t>
+      </w:r>
+      <w:r>
+        <w:t xml:space="preserve">.</w:t>
+      </w:r>
+      <w:r>
+        <w:t xml:space="preserve"> </w:t>
+      </w:r>
+      <w:r>
+        <w:t xml:space="preserve">“</w:t>
+      </w:r>
+      <w:r>
+        <w:t xml:space="preserve">Gozou na minha boca</w:t>
+      </w:r>
+      <w:r>
+        <w:t xml:space="preserve">”</w:t>
+      </w:r>
+      <w:r>
+        <w:t xml:space="preserve"> </w:t>
+      </w:r>
+      <w:r>
+        <w:t xml:space="preserve">→</w:t>
+      </w:r>
+      <w:r>
+        <w:t xml:space="preserve"> </w:t>
+      </w:r>
+      <w:r>
+        <w:t xml:space="preserve">“</w:t>
+      </w:r>
+      <w:r>
+        <w:t xml:space="preserve">came in my mouth</w:t>
+      </w:r>
+      <w:r>
+        <w:t xml:space="preserve">”</w:t>
+      </w:r>
+      <w:r>
+        <w:t xml:space="preserve">.</w:t>
+      </w:r>
+      <w:r>
+        <w:t xml:space="preserve"> </w:t>
+      </w:r>
+      <w:r>
+        <w:t xml:space="preserve">“</w:t>
+      </w:r>
+      <w:r>
+        <w:t xml:space="preserve">Encheu ela de porra</w:t>
+      </w:r>
+      <w:r>
+        <w:t xml:space="preserve">”</w:t>
+      </w:r>
+      <w:r>
+        <w:t xml:space="preserve"> </w:t>
+      </w:r>
+      <w:r>
+        <w:t xml:space="preserve">→</w:t>
+      </w:r>
+      <w:r>
+        <w:t xml:space="preserve"> </w:t>
+      </w:r>
+      <w:r>
+        <w:t xml:space="preserve">“</w:t>
+      </w:r>
+      <w:r>
+        <w:t xml:space="preserve">filled her with cum</w:t>
+      </w:r>
+      <w:r>
+        <w:t xml:space="preserve">”</w:t>
+      </w:r>
+      <w:r>
+        <w:t xml:space="preserve">.</w:t>
+      </w:r>
+      <w:r>
+        <w:t xml:space="preserve"> </w:t>
+      </w:r>
+      <w:r>
+        <w:t xml:space="preserve">“</w:t>
+      </w:r>
+      <w:r>
+        <w:t xml:space="preserve">Esguichou na cama</w:t>
+      </w:r>
+      <w:r>
+        <w:t xml:space="preserve">”</w:t>
+      </w:r>
+      <w:r>
+        <w:t xml:space="preserve"> </w:t>
+      </w:r>
+      <w:r>
+        <w:t xml:space="preserve">→</w:t>
+      </w:r>
+      <w:r>
+        <w:t xml:space="preserve"> </w:t>
+      </w:r>
+      <w:r>
+        <w:t xml:space="preserve">“</w:t>
+      </w:r>
+      <w:r>
+        <w:t xml:space="preserve">squirted all over the bed</w:t>
+      </w:r>
+      <w:r>
+        <w:t xml:space="preserve">”</w:t>
+      </w:r>
+      <w:r>
+        <w:t xml:space="preserve">. Verbo cru, ação, corpo.</w:t>
+      </w:r>
+    </w:p>
+    <w:p>
+      <w:pPr>
+        <w:numPr>
+          <w:ilvl w:val="0"/>
+          <w:numId w:val="1003"/>
+        </w:numPr>
+        <w:pStyle w:val="Compact"/>
+      </w:pPr>
+      <w:r>
+        <w:rPr>
+          <w:bCs/>
+          <w:b/>
+        </w:rPr>
+        <w:t xml:space="preserve">Sexo.</w:t>
+      </w:r>
+      <w:r>
+        <w:t xml:space="preserve"> </w:t>
+      </w:r>
+      <w:r>
+        <w:t xml:space="preserve">“</w:t>
+      </w:r>
+      <w:r>
+        <w:t xml:space="preserve">Me fodeu até eu não aguentar</w:t>
+      </w:r>
+      <w:r>
+        <w:t xml:space="preserve">”</w:t>
+      </w:r>
+      <w:r>
+        <w:t xml:space="preserve"> </w:t>
+      </w:r>
+      <w:r>
+        <w:t xml:space="preserve">→</w:t>
+      </w:r>
+      <w:r>
+        <w:t xml:space="preserve"> </w:t>
+      </w:r>
+      <w:r>
+        <w:t xml:space="preserve">“</w:t>
+      </w:r>
+      <w:r>
+        <w:t xml:space="preserve">fucked me until I couldn’t take it</w:t>
+      </w:r>
+      <w:r>
+        <w:t xml:space="preserve">”</w:t>
+      </w:r>
+      <w:r>
+        <w:t xml:space="preserve">, nunca</w:t>
+      </w:r>
+      <w:r>
+        <w:t xml:space="preserve"> </w:t>
+      </w:r>
+      <w:r>
+        <w:t xml:space="preserve">“</w:t>
+      </w:r>
+      <w:r>
+        <w:t xml:space="preserve">made love to me until I was exhausted</w:t>
+      </w:r>
+      <w:r>
+        <w:t xml:space="preserve">”</w:t>
+      </w:r>
+      <w:r>
+        <w:t xml:space="preserve">.</w:t>
+      </w:r>
+      <w:r>
+        <w:t xml:space="preserve"> </w:t>
+      </w:r>
+      <w:r>
+        <w:t xml:space="preserve">“</w:t>
+      </w:r>
+      <w:r>
+        <w:t xml:space="preserve">Socou com força</w:t>
+      </w:r>
+      <w:r>
+        <w:t xml:space="preserve">”</w:t>
+      </w:r>
+      <w:r>
+        <w:t xml:space="preserve"> </w:t>
+      </w:r>
+      <w:r>
+        <w:t xml:space="preserve">→</w:t>
+      </w:r>
+      <w:r>
+        <w:t xml:space="preserve"> </w:t>
+      </w:r>
+      <w:r>
+        <w:t xml:space="preserve">“</w:t>
+      </w:r>
+      <w:r>
+        <w:t xml:space="preserve">pounded me hard</w:t>
+      </w:r>
+      <w:r>
+        <w:t xml:space="preserve">”</w:t>
+      </w:r>
+      <w:r>
+        <w:t xml:space="preserve"> </w:t>
+      </w:r>
+      <w:r>
+        <w:t xml:space="preserve">/</w:t>
+      </w:r>
+      <w:r>
+        <w:t xml:space="preserve"> </w:t>
+      </w:r>
+      <w:r>
+        <w:t xml:space="preserve">“</w:t>
+      </w:r>
+      <w:r>
+        <w:t xml:space="preserve">slammed into me</w:t>
+      </w:r>
+      <w:r>
+        <w:t xml:space="preserve">”</w:t>
+      </w:r>
+      <w:r>
+        <w:t xml:space="preserve">.</w:t>
+      </w:r>
+      <w:r>
+        <w:t xml:space="preserve"> </w:t>
+      </w:r>
+      <w:r>
+        <w:t xml:space="preserve">“</w:t>
+      </w:r>
+      <w:r>
+        <w:t xml:space="preserve">Meteu até o fim</w:t>
+      </w:r>
+      <w:r>
+        <w:t xml:space="preserve">”</w:t>
+      </w:r>
+      <w:r>
+        <w:t xml:space="preserve"> </w:t>
+      </w:r>
+      <w:r>
+        <w:t xml:space="preserve">→</w:t>
+      </w:r>
+      <w:r>
+        <w:t xml:space="preserve"> </w:t>
+      </w:r>
+      <w:r>
+        <w:t xml:space="preserve">“</w:t>
+      </w:r>
+      <w:r>
+        <w:t xml:space="preserve">shoved it all the way in</w:t>
+      </w:r>
+      <w:r>
+        <w:t xml:space="preserve">”</w:t>
+      </w:r>
+      <w:r>
+        <w:t xml:space="preserve">.</w:t>
+      </w:r>
+      <w:r>
+        <w:t xml:space="preserve"> </w:t>
+      </w:r>
+      <w:r>
+        <w:t xml:space="preserve">“</w:t>
+      </w:r>
+      <w:r>
+        <w:t xml:space="preserve">Arrombou</w:t>
+      </w:r>
+      <w:r>
+        <w:t xml:space="preserve">”</w:t>
+      </w:r>
+      <w:r>
+        <w:t xml:space="preserve"> </w:t>
+      </w:r>
+      <w:r>
+        <w:t xml:space="preserve">→</w:t>
+      </w:r>
+      <w:r>
+        <w:t xml:space="preserve"> </w:t>
+      </w:r>
+      <w:r>
+        <w:t xml:space="preserve">“</w:t>
+      </w:r>
+      <w:r>
+        <w:t xml:space="preserve">wrecked</w:t>
+      </w:r>
+      <w:r>
+        <w:t xml:space="preserve">”</w:t>
+      </w:r>
+      <w:r>
+        <w:t xml:space="preserve"> </w:t>
+      </w:r>
+      <w:r>
+        <w:t xml:space="preserve">/</w:t>
+      </w:r>
+      <w:r>
+        <w:t xml:space="preserve"> </w:t>
+      </w:r>
+      <w:r>
+        <w:t xml:space="preserve">“</w:t>
+      </w:r>
+      <w:r>
+        <w:t xml:space="preserve">destroyed</w:t>
+      </w:r>
+      <w:r>
+        <w:t xml:space="preserve">”</w:t>
+      </w:r>
+      <w:r>
+        <w:t xml:space="preserve">.</w:t>
+      </w:r>
+      <w:r>
+        <w:t xml:space="preserve"> </w:t>
+      </w:r>
+      <w:r>
+        <w:t xml:space="preserve">“</w:t>
+      </w:r>
+      <w:r>
+        <w:t xml:space="preserve">Quebrou a cama</w:t>
+      </w:r>
+      <w:r>
+        <w:t xml:space="preserve">”</w:t>
+      </w:r>
+      <w:r>
+        <w:t xml:space="preserve"> </w:t>
+      </w:r>
+      <w:r>
+        <w:t xml:space="preserve">→</w:t>
+      </w:r>
+      <w:r>
+        <w:t xml:space="preserve"> </w:t>
+      </w:r>
+      <w:r>
+        <w:t xml:space="preserve">“</w:t>
+      </w:r>
+      <w:r>
+        <w:t xml:space="preserve">broke the bed</w:t>
+      </w:r>
+      <w:r>
+        <w:t xml:space="preserve">”</w:t>
+      </w:r>
+      <w:r>
+        <w:t xml:space="preserve">.</w:t>
+      </w:r>
+    </w:p>
+    <w:p>
+      <w:pPr>
+        <w:numPr>
+          <w:ilvl w:val="0"/>
+          <w:numId w:val="1003"/>
+        </w:numPr>
+        <w:pStyle w:val="Compact"/>
+      </w:pPr>
+      <w:r>
+        <w:rPr>
+          <w:bCs/>
+          <w:b/>
+        </w:rPr>
+        <w:t xml:space="preserve">Pau.</w:t>
+      </w:r>
+      <w:r>
+        <w:t xml:space="preserve"> </w:t>
+      </w:r>
+      <w:r>
+        <w:t xml:space="preserve">“</w:t>
+      </w:r>
+      <w:r>
+        <w:t xml:space="preserve">Pau duro feito pedra</w:t>
+      </w:r>
+      <w:r>
+        <w:t xml:space="preserve">”</w:t>
+      </w:r>
+      <w:r>
+        <w:t xml:space="preserve"> </w:t>
+      </w:r>
+      <w:r>
+        <w:t xml:space="preserve">→</w:t>
+      </w:r>
+      <w:r>
+        <w:t xml:space="preserve"> </w:t>
+      </w:r>
+      <w:r>
+        <w:t xml:space="preserve">“</w:t>
+      </w:r>
+      <w:r>
+        <w:t xml:space="preserve">rock hard dick</w:t>
+      </w:r>
+      <w:r>
+        <w:t xml:space="preserve">”</w:t>
+      </w:r>
+      <w:r>
+        <w:t xml:space="preserve">.</w:t>
+      </w:r>
+      <w:r>
+        <w:t xml:space="preserve"> </w:t>
+      </w:r>
+      <w:r>
+        <w:t xml:space="preserve">“</w:t>
+      </w:r>
+      <w:r>
+        <w:t xml:space="preserve">Pau batendo na coxa</w:t>
+      </w:r>
+      <w:r>
+        <w:t xml:space="preserve">”</w:t>
+      </w:r>
+      <w:r>
+        <w:t xml:space="preserve"> </w:t>
+      </w:r>
+      <w:r>
+        <w:t xml:space="preserve">→</w:t>
+      </w:r>
+      <w:r>
+        <w:t xml:space="preserve"> </w:t>
+      </w:r>
+      <w:r>
+        <w:t xml:space="preserve">“</w:t>
+      </w:r>
+      <w:r>
+        <w:t xml:space="preserve">dick slapping against his thigh</w:t>
+      </w:r>
+      <w:r>
+        <w:t xml:space="preserve">”</w:t>
+      </w:r>
+      <w:r>
+        <w:t xml:space="preserve">.</w:t>
+      </w:r>
+      <w:r>
+        <w:t xml:space="preserve"> </w:t>
+      </w:r>
+      <w:r>
+        <w:t xml:space="preserve">“</w:t>
+      </w:r>
+      <w:r>
+        <w:t xml:space="preserve">Veia pulando</w:t>
+      </w:r>
+      <w:r>
+        <w:t xml:space="preserve">”</w:t>
+      </w:r>
+      <w:r>
+        <w:t xml:space="preserve"> </w:t>
+      </w:r>
+      <w:r>
+        <w:t xml:space="preserve">→</w:t>
+      </w:r>
+      <w:r>
+        <w:t xml:space="preserve"> </w:t>
+      </w:r>
+      <w:r>
+        <w:t xml:space="preserve">“</w:t>
+      </w:r>
+      <w:r>
+        <w:t xml:space="preserve">veins popping</w:t>
+      </w:r>
+      <w:r>
+        <w:t xml:space="preserve">”</w:t>
+      </w:r>
+      <w:r>
+        <w:t xml:space="preserve">. Nunca</w:t>
+      </w:r>
+      <w:r>
+        <w:t xml:space="preserve"> </w:t>
+      </w:r>
+      <w:r>
+        <w:t xml:space="preserve">“</w:t>
+      </w:r>
+      <w:r>
+        <w:t xml:space="preserve">erection</w:t>
+      </w:r>
+      <w:r>
+        <w:t xml:space="preserve">”</w:t>
+      </w:r>
+      <w:r>
+        <w:t xml:space="preserve"> </w:t>
+      </w:r>
+      <w:r>
+        <w:t xml:space="preserve">na cena, só no laudo.</w:t>
+      </w:r>
+    </w:p>
+    <w:p>
+      <w:pPr>
+        <w:numPr>
+          <w:ilvl w:val="0"/>
+          <w:numId w:val="1003"/>
+        </w:numPr>
+        <w:pStyle w:val="Compact"/>
+      </w:pPr>
+      <w:r>
+        <w:rPr>
+          <w:bCs/>
+          <w:b/>
+        </w:rPr>
+        <w:t xml:space="preserve">Humilhação e vergonha.</w:t>
+      </w:r>
+      <w:r>
+        <w:t xml:space="preserve"> </w:t>
+      </w:r>
+      <w:r>
+        <w:t xml:space="preserve">“</w:t>
+      </w:r>
+      <w:r>
+        <w:t xml:space="preserve">Pau morto</w:t>
+      </w:r>
+      <w:r>
+        <w:t xml:space="preserve">”</w:t>
+      </w:r>
+      <w:r>
+        <w:t xml:space="preserve"> </w:t>
+      </w:r>
+      <w:r>
+        <w:t xml:space="preserve">→</w:t>
+      </w:r>
+      <w:r>
+        <w:t xml:space="preserve"> </w:t>
+      </w:r>
+      <w:r>
+        <w:t xml:space="preserve">“</w:t>
+      </w:r>
+      <w:r>
+        <w:t xml:space="preserve">dead dick</w:t>
+      </w:r>
+      <w:r>
+        <w:t xml:space="preserve">”</w:t>
+      </w:r>
+      <w:r>
+        <w:t xml:space="preserve">.</w:t>
+      </w:r>
+      <w:r>
+        <w:t xml:space="preserve"> </w:t>
+      </w:r>
+      <w:r>
+        <w:t xml:space="preserve">“</w:t>
+      </w:r>
+      <w:r>
+        <w:t xml:space="preserve">Broxou na frente dela</w:t>
+      </w:r>
+      <w:r>
+        <w:t xml:space="preserve">”</w:t>
+      </w:r>
+      <w:r>
+        <w:t xml:space="preserve"> </w:t>
+      </w:r>
+      <w:r>
+        <w:t xml:space="preserve">→</w:t>
+      </w:r>
+      <w:r>
+        <w:t xml:space="preserve"> </w:t>
+      </w:r>
+      <w:r>
+        <w:t xml:space="preserve">“</w:t>
+      </w:r>
+      <w:r>
+        <w:t xml:space="preserve">went limp right in front of her</w:t>
+      </w:r>
+      <w:r>
+        <w:t xml:space="preserve">”</w:t>
+      </w:r>
+      <w:r>
+        <w:t xml:space="preserve">.</w:t>
+      </w:r>
+      <w:r>
+        <w:t xml:space="preserve"> </w:t>
+      </w:r>
+      <w:r>
+        <w:t xml:space="preserve">“</w:t>
+      </w:r>
+      <w:r>
+        <w:t xml:space="preserve">Mole que nem macarrão cozido</w:t>
+      </w:r>
+      <w:r>
+        <w:t xml:space="preserve">”</w:t>
+      </w:r>
+      <w:r>
+        <w:t xml:space="preserve"> </w:t>
+      </w:r>
+      <w:r>
+        <w:t xml:space="preserve">→</w:t>
+      </w:r>
+      <w:r>
+        <w:t xml:space="preserve"> </w:t>
+      </w:r>
+      <w:r>
+        <w:t xml:space="preserve">“</w:t>
+      </w:r>
+      <w:r>
+        <w:t xml:space="preserve">soft as a wet noodle</w:t>
+      </w:r>
+      <w:r>
+        <w:t xml:space="preserve">”</w:t>
+      </w:r>
+      <w:r>
+        <w:t xml:space="preserve">.</w:t>
+      </w:r>
+      <w:r>
+        <w:t xml:space="preserve"> </w:t>
+      </w:r>
+      <w:r>
+        <w:t xml:space="preserve">“</w:t>
+      </w:r>
+      <w:r>
+        <w:t xml:space="preserve">Virou de costas pra ele</w:t>
+      </w:r>
+      <w:r>
+        <w:t xml:space="preserve">”</w:t>
+      </w:r>
+      <w:r>
+        <w:t xml:space="preserve"> </w:t>
+      </w:r>
+      <w:r>
+        <w:t xml:space="preserve">→</w:t>
+      </w:r>
+      <w:r>
+        <w:t xml:space="preserve"> </w:t>
+      </w:r>
+      <w:r>
+        <w:t xml:space="preserve">“</w:t>
+      </w:r>
+      <w:r>
+        <w:t xml:space="preserve">turned her back on him</w:t>
+      </w:r>
+      <w:r>
+        <w:t xml:space="preserve">”</w:t>
+      </w:r>
+      <w:r>
+        <w:t xml:space="preserve">. A vergonha do avatar tem que doer igual.</w:t>
+      </w:r>
+    </w:p>
+    <w:p>
+      <w:pPr>
+        <w:numPr>
+          <w:ilvl w:val="0"/>
+          <w:numId w:val="1003"/>
+        </w:numPr>
+        <w:pStyle w:val="Compact"/>
+      </w:pPr>
+      <w:r>
+        <w:rPr>
+          <w:bCs/>
+          <w:b/>
+        </w:rPr>
+        <w:t xml:space="preserve">Palavrão.</w:t>
+      </w:r>
+      <w:r>
+        <w:t xml:space="preserve"> </w:t>
+      </w:r>
+      <w:r>
+        <w:t xml:space="preserve">“</w:t>
+      </w:r>
+      <w:r>
+        <w:t xml:space="preserve">Porra</w:t>
+      </w:r>
+      <w:r>
+        <w:t xml:space="preserve">”</w:t>
+      </w:r>
+      <w:r>
+        <w:t xml:space="preserve"> </w:t>
+      </w:r>
+      <w:r>
+        <w:t xml:space="preserve">(interjeição) →</w:t>
+      </w:r>
+      <w:r>
+        <w:t xml:space="preserve"> </w:t>
+      </w:r>
+      <w:r>
+        <w:t xml:space="preserve">“</w:t>
+      </w:r>
+      <w:r>
+        <w:t xml:space="preserve">fuck</w:t>
+      </w:r>
+      <w:r>
+        <w:t xml:space="preserve">”</w:t>
+      </w:r>
+      <w:r>
+        <w:t xml:space="preserve"> </w:t>
+      </w:r>
+      <w:r>
+        <w:t xml:space="preserve">/</w:t>
+      </w:r>
+      <w:r>
+        <w:t xml:space="preserve"> </w:t>
+      </w:r>
+      <w:r>
+        <w:t xml:space="preserve">“</w:t>
+      </w:r>
+      <w:r>
+        <w:t xml:space="preserve">goddamn</w:t>
+      </w:r>
+      <w:r>
+        <w:t xml:space="preserve">”</w:t>
+      </w:r>
+      <w:r>
+        <w:t xml:space="preserve">;</w:t>
+      </w:r>
+      <w:r>
+        <w:t xml:space="preserve"> </w:t>
+      </w:r>
+      <w:r>
+        <w:t xml:space="preserve">“</w:t>
+      </w:r>
+      <w:r>
+        <w:t xml:space="preserve">caralho</w:t>
+      </w:r>
+      <w:r>
+        <w:t xml:space="preserve">”</w:t>
+      </w:r>
+      <w:r>
+        <w:t xml:space="preserve"> </w:t>
+      </w:r>
+      <w:r>
+        <w:t xml:space="preserve">→</w:t>
+      </w:r>
+      <w:r>
+        <w:t xml:space="preserve"> </w:t>
+      </w:r>
+      <w:r>
+        <w:t xml:space="preserve">“</w:t>
+      </w:r>
+      <w:r>
+        <w:t xml:space="preserve">fuck</w:t>
+      </w:r>
+      <w:r>
+        <w:t xml:space="preserve">”</w:t>
+      </w:r>
+      <w:r>
+        <w:t xml:space="preserve"> </w:t>
+      </w:r>
+      <w:r>
+        <w:t xml:space="preserve">/</w:t>
+      </w:r>
+      <w:r>
+        <w:t xml:space="preserve"> </w:t>
+      </w:r>
+      <w:r>
+        <w:t xml:space="preserve">“</w:t>
+      </w:r>
+      <w:r>
+        <w:t xml:space="preserve">holy shit</w:t>
+      </w:r>
+      <w:r>
+        <w:t xml:space="preserve">”</w:t>
+      </w:r>
+      <w:r>
+        <w:t xml:space="preserve">;</w:t>
+      </w:r>
+      <w:r>
+        <w:t xml:space="preserve"> </w:t>
+      </w:r>
+      <w:r>
+        <w:t xml:space="preserve">“</w:t>
+      </w:r>
+      <w:r>
+        <w:t xml:space="preserve">puta que pariu</w:t>
+      </w:r>
+      <w:r>
+        <w:t xml:space="preserve">”</w:t>
+      </w:r>
+      <w:r>
+        <w:t xml:space="preserve"> </w:t>
+      </w:r>
+      <w:r>
+        <w:t xml:space="preserve">→</w:t>
+      </w:r>
+      <w:r>
+        <w:t xml:space="preserve"> </w:t>
+      </w:r>
+      <w:r>
+        <w:t xml:space="preserve">“</w:t>
+      </w:r>
+      <w:r>
+        <w:t xml:space="preserve">holy fucking shit</w:t>
+      </w:r>
+      <w:r>
+        <w:t xml:space="preserve">”</w:t>
+      </w:r>
+      <w:r>
+        <w:t xml:space="preserve"> </w:t>
+      </w:r>
+      <w:r>
+        <w:t xml:space="preserve">/</w:t>
+      </w:r>
+      <w:r>
+        <w:t xml:space="preserve"> </w:t>
+      </w:r>
+      <w:r>
+        <w:t xml:space="preserve">“</w:t>
+      </w:r>
+      <w:r>
+        <w:t xml:space="preserve">son of a bitch</w:t>
+      </w:r>
+      <w:r>
+        <w:t xml:space="preserve">”</w:t>
+      </w:r>
+      <w:r>
+        <w:t xml:space="preserve">;</w:t>
+      </w:r>
+      <w:r>
+        <w:t xml:space="preserve"> </w:t>
+      </w:r>
+      <w:r>
+        <w:t xml:space="preserve">“</w:t>
+      </w:r>
+      <w:r>
+        <w:t xml:space="preserve">do caralho</w:t>
+      </w:r>
+      <w:r>
+        <w:t xml:space="preserve">”</w:t>
+      </w:r>
+      <w:r>
+        <w:t xml:space="preserve"> </w:t>
+      </w:r>
+      <w:r>
+        <w:t xml:space="preserve">(positivo) →</w:t>
+      </w:r>
+      <w:r>
+        <w:t xml:space="preserve"> </w:t>
+      </w:r>
+      <w:r>
+        <w:t xml:space="preserve">“</w:t>
+      </w:r>
+      <w:r>
+        <w:t xml:space="preserve">fucking amazing</w:t>
+      </w:r>
+      <w:r>
+        <w:t xml:space="preserve">”</w:t>
+      </w:r>
+      <w:r>
+        <w:t xml:space="preserve"> </w:t>
+      </w:r>
+      <w:r>
+        <w:t xml:space="preserve">/</w:t>
+      </w:r>
+      <w:r>
+        <w:t xml:space="preserve"> </w:t>
+      </w:r>
+      <w:r>
+        <w:t xml:space="preserve">“</w:t>
+      </w:r>
+      <w:r>
+        <w:t xml:space="preserve">one hell of a</w:t>
+      </w:r>
+      <w:r>
+        <w:t xml:space="preserve">”</w:t>
+      </w:r>
+      <w:r>
+        <w:t xml:space="preserve">.</w:t>
+      </w:r>
+      <w:r>
+        <w:t xml:space="preserve"> </w:t>
+      </w:r>
+      <w:r>
+        <w:t xml:space="preserve">“</w:t>
+      </w:r>
+      <w:r>
+        <w:t xml:space="preserve">Filho da puta</w:t>
+      </w:r>
+      <w:r>
+        <w:t xml:space="preserve">”</w:t>
+      </w:r>
+      <w:r>
+        <w:t xml:space="preserve"> </w:t>
+      </w:r>
+      <w:r>
+        <w:t xml:space="preserve">→</w:t>
+      </w:r>
+      <w:r>
+        <w:t xml:space="preserve"> </w:t>
+      </w:r>
+      <w:r>
+        <w:t xml:space="preserve">“</w:t>
+      </w:r>
+      <w:r>
+        <w:t xml:space="preserve">son of a bitch</w:t>
+      </w:r>
+      <w:r>
+        <w:t xml:space="preserve">”</w:t>
+      </w:r>
+      <w:r>
+        <w:t xml:space="preserve"> </w:t>
+      </w:r>
+      <w:r>
+        <w:t xml:space="preserve">/</w:t>
+      </w:r>
+      <w:r>
+        <w:t xml:space="preserve"> </w:t>
+      </w:r>
+      <w:r>
+        <w:t xml:space="preserve">“</w:t>
+      </w:r>
+      <w:r>
+        <w:t xml:space="preserve">motherfucker</w:t>
+      </w:r>
+      <w:r>
+        <w:t xml:space="preserve">”</w:t>
+      </w:r>
+      <w:r>
+        <w:t xml:space="preserve"> </w:t>
+      </w:r>
+      <w:r>
+        <w:t xml:space="preserve">conforme a raiva.</w:t>
+      </w:r>
+    </w:p>
+    <w:p>
+      <w:pPr>
+        <w:pStyle w:val="FirstParagraph"/>
+      </w:pPr>
+      <w:r>
+        <w:rPr>
+          <w:bCs/>
+          <w:b/>
+        </w:rPr>
+        <w:t xml:space="preserve">Frases mortas (proibidas em cena sexual, mesmo que a gramática aceite):</w:t>
+      </w:r>
+      <w:r>
+        <w:t xml:space="preserve"> </w:t>
+      </w:r>
+      <w:r>
+        <w:t xml:space="preserve">climaxed · reached orgasm · finished · was satisfied · pleasured her · made love · were intimate · had relations · got physical · his manhood · his member · her womanhood · her flower · her center · down there · lady parts · performed well · performance in bed · bedroom problems · couldn’t perform · intimate moment · adult activities · engaged in intercourse · ejaculated (fora de laudo) · aroused state · erect (fora de laudo).</w:t>
+      </w:r>
+    </w:p>
+    <w:p>
+      <w:pPr>
+        <w:pStyle w:val="BodyText"/>
+      </w:pPr>
+      <w:r>
+        <w:rPr>
+          <w:bCs/>
+          <w:b/>
+        </w:rPr>
+        <w:t xml:space="preserve">Teste da carga:</w:t>
+      </w:r>
+      <w:r>
+        <w:t xml:space="preserve"> </w:t>
+      </w:r>
+      <w:r>
+        <w:t xml:space="preserve">leia a frase em inglês em voz alta como se fosse um homem de 55 anos contando pro amigo. Se soou como laudo médico, legenda de filme ou texto de banco, está pra baixo. Reescreva com a palavra crua até a carga bater com o PT. Pra cima também não:</w:t>
+      </w:r>
+      <w:r>
+        <w:t xml:space="preserve"> </w:t>
+      </w:r>
+      <w:r>
+        <w:t xml:space="preserve">“</w:t>
+      </w:r>
+      <w:r>
+        <w:t xml:space="preserve">transar</w:t>
+      </w:r>
+      <w:r>
+        <w:t xml:space="preserve">”</w:t>
+      </w:r>
+      <w:r>
+        <w:t xml:space="preserve"> </w:t>
+      </w:r>
+      <w:r>
+        <w:t xml:space="preserve">não vira</w:t>
+      </w:r>
+      <w:r>
+        <w:t xml:space="preserve"> </w:t>
+      </w:r>
+      <w:r>
+        <w:t xml:space="preserve">“</w:t>
+      </w:r>
+      <w:r>
+        <w:t xml:space="preserve">fuck her brains out</w:t>
+      </w:r>
+      <w:r>
+        <w:t xml:space="preserve">”</w:t>
+      </w:r>
+      <w:r>
+        <w:t xml:space="preserve"> </w:t>
+      </w:r>
+      <w:r>
+        <w:t xml:space="preserve">se o PT não disse isso.</w:t>
+      </w:r>
+    </w:p>
+    <w:bookmarkEnd w:id="26"/>
+    <w:bookmarkEnd w:id="27"/>
+    <w:bookmarkStart w:id="28" w:name="nicho-fixo-em-ed"/>
+    <w:p>
+      <w:pPr>
+        <w:pStyle w:val="Heading2"/>
+      </w:pPr>
+      <w:r>
+        <w:t xml:space="preserve">5. NICHO: FIXO EM ED</w:t>
+      </w:r>
+    </w:p>
+    <w:p>
+      <w:pPr>
+        <w:pStyle w:val="FirstParagraph"/>
+      </w:pPr>
+      <w:r>
+        <w:t xml:space="preserve">Não há detecção de nicho. Toda copy que entrar neste prompt é de disfunção erétil, aumento e desempenho sexual masculino, com universo de rancho de touros Longhorn no Texas. Aplique a seção 8 inteira, sempre. Se a copy misturar prova de fertilidade, testosterona ou próstata, são sub-temas do mesmo nicho, não nichos à parte.</w:t>
+      </w:r>
+    </w:p>
+    <w:bookmarkEnd w:id="28"/>
+    <w:bookmarkStart w:id="29" w:name="o-que-nunca-alterar"/>
+    <w:p>
+      <w:pPr>
+        <w:pStyle w:val="Heading2"/>
+      </w:pPr>
+      <w:r>
+        <w:t xml:space="preserve">6. O QUE NUNCA ALTERAR</w:t>
+      </w:r>
+    </w:p>
+    <w:p>
+      <w:pPr>
+        <w:numPr>
+          <w:ilvl w:val="0"/>
+          <w:numId w:val="1004"/>
+        </w:numPr>
+        <w:pStyle w:val="Compact"/>
+      </w:pPr>
+      <w:r>
         <w:t xml:space="preserve">Números, valores, estatísticas, datas, porcentagens, polegadas, quilos, minutos, dias, horas, doses, protocolos, códigos (3 gramas, 14 vezes, 70 a 80%, 7 polegadas, 5,63 → 8,46, 72 horas, $49, $294, $3.777, NCT06182394, 21 CFR 111). Polegadas e dólares já estão no padrão americano:</w:t>
       </w:r>
       <w:r>
@@ -955,7 +2080,7 @@
       <w:pPr>
         <w:numPr>
           <w:ilvl w:val="0"/>
-          <w:numId w:val="1003"/>
+          <w:numId w:val="1004"/>
         </w:numPr>
         <w:pStyle w:val="Compact"/>
       </w:pPr>
@@ -967,7 +2092,7 @@
       <w:pPr>
         <w:numPr>
           <w:ilvl w:val="0"/>
-          <w:numId w:val="1003"/>
+          <w:numId w:val="1004"/>
         </w:numPr>
         <w:pStyle w:val="Compact"/>
       </w:pPr>
@@ -979,7 +2104,7 @@
       <w:pPr>
         <w:numPr>
           <w:ilvl w:val="0"/>
-          <w:numId w:val="1003"/>
+          <w:numId w:val="1004"/>
         </w:numPr>
         <w:pStyle w:val="Compact"/>
       </w:pPr>
@@ -1039,7 +2164,7 @@
       <w:pPr>
         <w:numPr>
           <w:ilvl w:val="0"/>
-          <w:numId w:val="1003"/>
+          <w:numId w:val="1004"/>
         </w:numPr>
         <w:pStyle w:val="Compact"/>
       </w:pPr>
@@ -1061,7 +2186,7 @@
       <w:pPr>
         <w:numPr>
           <w:ilvl w:val="0"/>
-          <w:numId w:val="1003"/>
+          <w:numId w:val="1004"/>
         </w:numPr>
         <w:pStyle w:val="Compact"/>
       </w:pPr>
@@ -1089,7 +2214,7 @@
       <w:pPr>
         <w:numPr>
           <w:ilvl w:val="0"/>
-          <w:numId w:val="1003"/>
+          <w:numId w:val="1004"/>
         </w:numPr>
         <w:pStyle w:val="Compact"/>
       </w:pPr>
@@ -1410,8 +2535,8 @@
         <w:t xml:space="preserve">”</w:t>
       </w:r>
     </w:p>
-    <w:bookmarkEnd w:id="28"/>
-    <w:bookmarkStart w:id="37" w:name="como-adaptar-e-só-isso"/>
+    <w:bookmarkEnd w:id="29"/>
+    <w:bookmarkStart w:id="38" w:name="como-adaptar-e-só-isso"/>
     <w:p>
       <w:pPr>
         <w:pStyle w:val="Heading2"/>
@@ -1420,7 +2545,7 @@
         <w:t xml:space="preserve">7. COMO ADAPTAR (e só isso)</w:t>
       </w:r>
     </w:p>
-    <w:bookmarkStart w:id="29" w:name="termos-médicos-e-anatômicos"/>
+    <w:bookmarkStart w:id="30" w:name="termos-médicos-e-anatômicos"/>
     <w:p>
       <w:pPr>
         <w:pStyle w:val="Heading3"/>
@@ -1558,8 +2683,8 @@
         <w:t xml:space="preserve">- ressonância → MRI · laudo → lab report / report · exame de aptidão reprodutiva → breeding soundness exam · libido: satisfatória → Libido: satisfactory</w:t>
       </w:r>
     </w:p>
-    <w:bookmarkEnd w:id="29"/>
-    <w:bookmarkStart w:id="30" w:name="falsos-amigos-pten"/>
+    <w:bookmarkEnd w:id="30"/>
+    <w:bookmarkStart w:id="31" w:name="falsos-amigos-pten"/>
     <w:p>
       <w:pPr>
         <w:pStyle w:val="Heading3"/>
@@ -1946,8 +3071,8 @@
         <w:t xml:space="preserve">→ wake up horny)</w:t>
       </w:r>
     </w:p>
-    <w:bookmarkEnd w:id="30"/>
-    <w:bookmarkStart w:id="31" w:name="medicamentos-e-substâncias"/>
+    <w:bookmarkEnd w:id="31"/>
+    <w:bookmarkStart w:id="32" w:name="medicamentos-e-substâncias"/>
     <w:p>
       <w:pPr>
         <w:pStyle w:val="Heading3"/>
@@ -2090,8 +3215,8 @@
         <w:t xml:space="preserve">→ herbs.</w:t>
       </w:r>
     </w:p>
-    <w:bookmarkEnd w:id="31"/>
-    <w:bookmarkStart w:id="32" w:name="instituições"/>
+    <w:bookmarkEnd w:id="32"/>
+    <w:bookmarkStart w:id="33" w:name="instituições"/>
     <w:p>
       <w:pPr>
         <w:pStyle w:val="Heading3"/>
@@ -2108,8 +3233,8 @@
         <w:t xml:space="preserve">Forma oficial em inglês. Secretário de Saúde dos Estados Unidos → U.S. Secretary of Health and Human Services. Universidade de Medicina de Stanford → Stanford School of Medicine. Universidade da Califórnia → University of California. Clínica de LA → LA clinic.</w:t>
       </w:r>
     </w:p>
-    <w:bookmarkEnd w:id="32"/>
-    <w:bookmarkStart w:id="33" w:name="unidades-números-e-horas"/>
+    <w:bookmarkEnd w:id="33"/>
+    <w:bookmarkStart w:id="34" w:name="unidades-números-e-horas"/>
     <w:p>
       <w:pPr>
         <w:pStyle w:val="Heading3"/>
@@ -2157,8 +3282,8 @@
         <w:t xml:space="preserve">→ billion. Moeda: $ fica $.</w:t>
       </w:r>
     </w:p>
-    <w:bookmarkEnd w:id="33"/>
-    <w:bookmarkStart w:id="34" w:name="pontuação"/>
+    <w:bookmarkEnd w:id="34"/>
+    <w:bookmarkStart w:id="35" w:name="pontuação"/>
     <w:p>
       <w:pPr>
         <w:pStyle w:val="Heading3"/>
@@ -2217,8 +3342,8 @@
         <w:t xml:space="preserve">) ficam de uma palavra.</w:t>
       </w:r>
     </w:p>
-    <w:bookmarkEnd w:id="34"/>
-    <w:bookmarkStart w:id="35" w:name="idiomatismos-e-ditados"/>
+    <w:bookmarkEnd w:id="35"/>
+    <w:bookmarkStart w:id="36" w:name="idiomatismos-e-ditados"/>
     <w:p>
       <w:pPr>
         <w:pStyle w:val="Heading3"/>
@@ -2517,8 +3642,8 @@
         <w:t xml:space="preserve">”</w:t>
       </w:r>
     </w:p>
-    <w:bookmarkEnd w:id="35"/>
-    <w:bookmarkStart w:id="36" w:name="persuasão-e-ganchos"/>
+    <w:bookmarkEnd w:id="36"/>
+    <w:bookmarkStart w:id="37" w:name="persuasão-e-ganchos"/>
     <w:p>
       <w:pPr>
         <w:pStyle w:val="Heading3"/>
@@ -2535,9 +3660,9 @@
         <w:t xml:space="preserve">Mantêm o impacto recriando o efeito em inglês coloquial, não palavra por palavra. A exceção são as frases-âncora da seção 6, que são fixas.</w:t>
       </w:r>
     </w:p>
-    <w:bookmarkEnd w:id="36"/>
     <w:bookmarkEnd w:id="37"/>
-    <w:bookmarkStart w:id="43" w:name="Xa23972781ff5879b2d6a50177256022983bc648"/>
+    <w:bookmarkEnd w:id="38"/>
+    <w:bookmarkStart w:id="44" w:name="Xa23972781ff5879b2d6a50177256022983bc648"/>
     <w:p>
       <w:pPr>
         <w:pStyle w:val="Heading2"/>
@@ -2546,7 +3671,7 @@
         <w:t xml:space="preserve">8. GLOSSÁRIO DE REFERÊNCIA — ED, SEXO E RANCHO (obrigatório, literal)</w:t>
       </w:r>
     </w:p>
-    <w:bookmarkStart w:id="38" w:name="o-corpo-e-o-problema"/>
+    <w:bookmarkStart w:id="39" w:name="o-corpo-e-o-problema"/>
     <w:p>
       <w:pPr>
         <w:pStyle w:val="Heading3"/>
@@ -3602,8 +4727,8 @@
         </w:tc>
       </w:tr>
     </w:tbl>
-    <w:bookmarkEnd w:id="38"/>
-    <w:bookmarkStart w:id="39" w:name="o-ato-tradução-literal-sem-suavizar"/>
+    <w:bookmarkEnd w:id="39"/>
+    <w:bookmarkStart w:id="40" w:name="o-ato-tradução-literal-sem-suavizar"/>
     <w:p>
       <w:pPr>
         <w:pStyle w:val="Heading3"/>
@@ -4593,8 +5718,8 @@
         </w:tc>
       </w:tr>
     </w:tbl>
-    <w:bookmarkEnd w:id="39"/>
-    <w:bookmarkStart w:id="40" w:name="pessoas-e-relações"/>
+    <w:bookmarkEnd w:id="40"/>
+    <w:bookmarkStart w:id="41" w:name="pessoas-e-relações"/>
     <w:p>
       <w:pPr>
         <w:pStyle w:val="Heading3"/>
@@ -5164,8 +6289,8 @@
         </w:tc>
       </w:tr>
     </w:tbl>
-    <w:bookmarkEnd w:id="40"/>
-    <w:bookmarkStart w:id="41" w:name="rancho-e-touro"/>
+    <w:bookmarkEnd w:id="41"/>
+    <w:bookmarkStart w:id="42" w:name="rancho-e-touro"/>
     <w:p>
       <w:pPr>
         <w:pStyle w:val="Heading3"/>
@@ -6208,8 +7333,8 @@
         </w:tc>
       </w:tr>
     </w:tbl>
-    <w:bookmarkEnd w:id="41"/>
-    <w:bookmarkStart w:id="42" w:name="transversais"/>
+    <w:bookmarkEnd w:id="42"/>
+    <w:bookmarkStart w:id="43" w:name="transversais"/>
     <w:p>
       <w:pPr>
         <w:pStyle w:val="Heading3"/>
@@ -6727,9 +7852,9 @@
         </w:tc>
       </w:tr>
     </w:tbl>
-    <w:bookmarkEnd w:id="42"/>
     <w:bookmarkEnd w:id="43"/>
-    <w:bookmarkStart w:id="44" w:name="Xe2591c324a666a97399b0f455298db8b9274c6b"/>
+    <w:bookmarkEnd w:id="44"/>
+    <w:bookmarkStart w:id="45" w:name="Xe2591c324a666a97399b0f455298db8b9274c6b"/>
     <w:p>
       <w:pPr>
         <w:pStyle w:val="Heading2"/>
@@ -6742,7 +7867,7 @@
       <w:pPr>
         <w:numPr>
           <w:ilvl w:val="0"/>
-          <w:numId w:val="1004"/>
+          <w:numId w:val="1005"/>
         </w:numPr>
         <w:pStyle w:val="Compact"/>
       </w:pPr>
@@ -6821,7 +7946,7 @@
       <w:pPr>
         <w:numPr>
           <w:ilvl w:val="0"/>
-          <w:numId w:val="1004"/>
+          <w:numId w:val="1005"/>
         </w:numPr>
         <w:pStyle w:val="Compact"/>
       </w:pPr>
@@ -6954,7 +8079,7 @@
       <w:pPr>
         <w:numPr>
           <w:ilvl w:val="0"/>
-          <w:numId w:val="1004"/>
+          <w:numId w:val="1005"/>
         </w:numPr>
         <w:pStyle w:val="Compact"/>
       </w:pPr>
@@ -7084,7 +8209,7 @@
       <w:pPr>
         <w:numPr>
           <w:ilvl w:val="0"/>
-          <w:numId w:val="1004"/>
+          <w:numId w:val="1005"/>
         </w:numPr>
         <w:pStyle w:val="Compact"/>
       </w:pPr>
@@ -7208,7 +8333,7 @@
       <w:pPr>
         <w:numPr>
           <w:ilvl w:val="0"/>
-          <w:numId w:val="1004"/>
+          <w:numId w:val="1005"/>
         </w:numPr>
         <w:pStyle w:val="Compact"/>
       </w:pPr>
@@ -7338,7 +8463,7 @@
       <w:pPr>
         <w:numPr>
           <w:ilvl w:val="0"/>
-          <w:numId w:val="1004"/>
+          <w:numId w:val="1005"/>
         </w:numPr>
         <w:pStyle w:val="Compact"/>
       </w:pPr>
@@ -7372,7 +8497,7 @@
       <w:pPr>
         <w:numPr>
           <w:ilvl w:val="0"/>
-          <w:numId w:val="1004"/>
+          <w:numId w:val="1005"/>
         </w:numPr>
         <w:pStyle w:val="Compact"/>
       </w:pPr>
@@ -7406,7 +8531,7 @@
       <w:pPr>
         <w:numPr>
           <w:ilvl w:val="0"/>
-          <w:numId w:val="1004"/>
+          <w:numId w:val="1005"/>
         </w:numPr>
         <w:pStyle w:val="Compact"/>
       </w:pPr>
@@ -7428,7 +8553,7 @@
       <w:pPr>
         <w:numPr>
           <w:ilvl w:val="0"/>
-          <w:numId w:val="1004"/>
+          <w:numId w:val="1005"/>
         </w:numPr>
         <w:pStyle w:val="Compact"/>
       </w:pPr>
@@ -7446,8 +8571,8 @@
         <w:t xml:space="preserve">nunca traduzir (seção 3).</w:t>
       </w:r>
     </w:p>
-    <w:bookmarkEnd w:id="44"/>
-    <w:bookmarkStart w:id="47" w:name="saída-apenas-en-us"/>
+    <w:bookmarkEnd w:id="45"/>
+    <w:bookmarkStart w:id="48" w:name="saída-apenas-en-us"/>
     <w:p>
       <w:pPr>
         <w:pStyle w:val="Heading2"/>
@@ -7474,7 +8599,7 @@
         <w:t xml:space="preserve">Nenhuma cópia limpa, nenhum espelho, nenhuma tradução de volta. A entrega é um único artifact em inglês mais o relatório no chat.</w:t>
       </w:r>
     </w:p>
-    <w:bookmarkStart w:id="45" w:name="Xd4e38d744fa08c013c64e2e58b8862a56ea8282"/>
+    <w:bookmarkStart w:id="46" w:name="Xd4e38d744fa08c013c64e2e58b8862a56ea8282"/>
     <w:p>
       <w:pPr>
         <w:pStyle w:val="Heading3"/>
@@ -7503,8 +8628,8 @@
         <w:t xml:space="preserve">.</w:t>
       </w:r>
     </w:p>
-    <w:bookmarkEnd w:id="45"/>
-    <w:bookmarkStart w:id="46" w:name="X65a888372ebc6bf5d0eceeabbd46e02a305be2e"/>
+    <w:bookmarkEnd w:id="46"/>
+    <w:bookmarkStart w:id="47" w:name="X65a888372ebc6bf5d0eceeabbd46e02a305be2e"/>
     <w:p>
       <w:pPr>
         <w:pStyle w:val="Heading3"/>
@@ -7563,7 +8688,7 @@
         <w:rPr>
           <w:rStyle w:val="VerbatimChar"/>
         </w:rPr>
-        <w:t xml:space="preserve">🔞 TERMOS CHULOS E SEXUAIS (tradução literal confirmada)</w:t>
+        <w:t xml:space="preserve">🔞 TERMOS CHULOS E SEXUAIS (tradução literal confirmada, mesma carga)</w:t>
       </w:r>
       <w:r>
         <w:br/>
@@ -7578,6 +8703,15 @@
         <w:br/>
       </w:r>
       <w:r>
+        <w:rPr>
+          <w:rStyle w:val="VerbatimChar"/>
+        </w:rPr>
+        <w:t xml:space="preserve">- confirmação: "nenhuma frase morta da seção 4.2 na copy"</w:t>
+      </w:r>
+      <w:r>
+        <w:br/>
+      </w:r>
+      <w:r>
         <w:br/>
       </w:r>
       <w:r>
@@ -7647,9 +8781,9 @@
         <w:t xml:space="preserve">- (se não houver: "Nenhum.")</w:t>
       </w:r>
     </w:p>
-    <w:bookmarkEnd w:id="46"/>
     <w:bookmarkEnd w:id="47"/>
-    <w:bookmarkStart w:id="48" w:name="typos-ocr-e-ambiguidades"/>
+    <w:bookmarkEnd w:id="48"/>
+    <w:bookmarkStart w:id="49" w:name="typos-ocr-e-ambiguidades"/>
     <w:p>
       <w:pPr>
         <w:pStyle w:val="Heading2"/>
@@ -7717,8 +8851,8 @@
         <w:t xml:space="preserve">): escolha a leitura mais crua se o contexto for sexual, e sinalize a alternativa no relatório.</w:t>
       </w:r>
     </w:p>
-    <w:bookmarkEnd w:id="48"/>
-    <w:bookmarkStart w:id="49" w:name="consistência-entre-rodadas"/>
+    <w:bookmarkEnd w:id="49"/>
+    <w:bookmarkStart w:id="50" w:name="consistência-entre-rodadas"/>
     <w:p>
       <w:pPr>
         <w:pStyle w:val="Heading2"/>
@@ -7838,8 +8972,8 @@
         <w:t xml:space="preserve">, é feita na primeira rodada e nunca muda.</w:t>
       </w:r>
     </w:p>
-    <w:bookmarkEnd w:id="49"/>
-    <w:bookmarkStart w:id="50" w:name="controle-de-tamanho-novo"/>
+    <w:bookmarkEnd w:id="50"/>
+    <w:bookmarkStart w:id="51" w:name="controle-de-tamanho-novo"/>
     <w:p>
       <w:pPr>
         <w:pStyle w:val="Heading2"/>
@@ -7932,8 +9066,8 @@
         <w:t xml:space="preserve">, e dobras de adjetivo. Se sair mais de 15% menor, algo foi cortado: confira frase a frase. Reporte os dois números na Parte 2.</w:t>
       </w:r>
     </w:p>
-    <w:bookmarkEnd w:id="50"/>
-    <w:bookmarkStart w:id="51" w:name="checklist-final"/>
+    <w:bookmarkEnd w:id="51"/>
+    <w:bookmarkStart w:id="52" w:name="checklist-final"/>
     <w:p>
       <w:pPr>
         <w:pStyle w:val="Heading2"/>
@@ -7981,6 +9115,12 @@
         <w:t xml:space="preserve"> </w:t>
       </w:r>
       <w:r>
+        <w:t xml:space="preserve">- [ ] Cada cena de sexo, orgasmo e palavrão com a mesma carga do PT, nunca pra baixo (seção 4.2)? Nenhuma frase morta (climaxed, finished, made love, manhood, performed)?</w:t>
+      </w:r>
+      <w:r>
+        <w:t xml:space="preserve"> </w:t>
+      </w:r>
+      <w:r>
         <w:t xml:space="preserve">- [ ] Termos médicos só onde o PT usa termo médico;</w:t>
       </w:r>
       <w:r>
@@ -8080,8 +9220,8 @@
         <w:t xml:space="preserve">onde não houver?</w:t>
       </w:r>
     </w:p>
-    <w:bookmarkEnd w:id="51"/>
     <w:bookmarkEnd w:id="52"/>
+    <w:bookmarkEnd w:id="53"/>
     <w:sectPr/>
   </w:body>
 </w:document>
@@ -8277,6 +9417,9 @@
     <w:abstractNumId w:val="991"/>
   </w:num>
   <w:num w:numId="1004">
+    <w:abstractNumId w:val="991"/>
+  </w:num>
+  <w:num w:numId="1005">
     <w:abstractNumId w:val="991"/>
   </w:num>
 </w:numbering>

</xml_diff>

<commit_message>
Quilos → libras: 33 pounds no Bloco 1 e regra fixa no prompt de tradução
Co-Authored-By: Claude Fable 5.1 <noreply@anthropic.com>
Claude-Session: https://claude.ai/code/session_017HYp1xhSzB6Ui5hyJvLbGE
</commit_message>
<xml_diff>
--- a/analise-ed/PROMPT_Traducao_VSL_ED_EN-US.docx
+++ b/analise-ed/PROMPT_Traducao_VSL_ED_EN-US.docx
@@ -3248,7 +3248,7 @@
         <w:pStyle w:val="FirstParagraph"/>
       </w:pPr>
       <w:r>
-        <w:t xml:space="preserve">Polegadas, dólares, quilos (15 quilos → 33 pounds</w:t>
+        <w:t xml:space="preserve">Polegadas e dólares ficam como estão.</w:t>
       </w:r>
       <w:r>
         <w:t xml:space="preserve"> </w:t>
@@ -3258,10 +3258,13 @@
           <w:bCs/>
           <w:b/>
         </w:rPr>
-        <w:t xml:space="preserve">só se o usuário pedir conversão; padrão: manter 15 kilos</w:t>
-      </w:r>
-      <w:r>
-        <w:t xml:space="preserve">), minutos e dias ficam como estão. Decimais: 5,63 → 5.63; 8,46 → 8.46; 3,5 polegadas → 3.5 inches. Milhares: 3.000 → 3,000; 1.000 → 1,000. Horas: 6h04 → 6:04 a.m.; 4 da manhã → 4 in the morning / 4 a.m.; 7 da manhã → 7 a.m. Datas: 14 de janeiro → January 14th.</w:t>
+        <w:t xml:space="preserve">Quilos sempre viram libras</w:t>
+      </w:r>
+      <w:r>
+        <w:t xml:space="preserve"> </w:t>
+      </w:r>
+      <w:r>
+        <w:t xml:space="preserve">(15 quilos → 33 pounds; 1 kg = 2,2 lb, arredondar para inteiro). Metros viram yards ou feet (200 metros → 200 yards; 15 metros → 50 feet). Minutos, horas e dias ficam. Decimais: 5,63 → 5.63; 8,46 → 8.46; 3,5 polegadas → 3.5 inches. Milhares: 3.000 → 3,000; 1.000 → 1,000. Horas: 6h04 → 6:04 a.m.; 4 da manhã → 4 in the morning / 4 a.m.; 7 da manhã → 7 a.m. Datas: 14 de janeiro → January 14th.</w:t>
       </w:r>
       <w:r>
         <w:t xml:space="preserve"> </w:t>

</xml_diff>

<commit_message>
Libras em número redondo: 30 pounds no Bloco 1 e no prompt
Co-Authored-By: Claude Fable 5.1 <noreply@anthropic.com>
Claude-Session: https://claude.ai/code/session_017HYp1xhSzB6Ui5hyJvLbGE
</commit_message>
<xml_diff>
--- a/analise-ed/PROMPT_Traducao_VSL_ED_EN-US.docx
+++ b/analise-ed/PROMPT_Traducao_VSL_ED_EN-US.docx
@@ -3258,13 +3258,28 @@
           <w:bCs/>
           <w:b/>
         </w:rPr>
-        <w:t xml:space="preserve">Quilos sempre viram libras</w:t>
-      </w:r>
-      <w:r>
-        <w:t xml:space="preserve"> </w:t>
-      </w:r>
-      <w:r>
-        <w:t xml:space="preserve">(15 quilos → 33 pounds; 1 kg = 2,2 lb, arredondar para inteiro). Metros viram yards ou feet (200 metros → 200 yards; 15 metros → 50 feet). Minutos, horas e dias ficam. Decimais: 5,63 → 5.63; 8,46 → 8.46; 3,5 polegadas → 3.5 inches. Milhares: 3.000 → 3,000; 1.000 → 1,000. Horas: 6h04 → 6:04 a.m.; 4 da manhã → 4 in the morning / 4 a.m.; 7 da manhã → 7 a.m. Datas: 14 de janeiro → January 14th.</w:t>
+        <w:t xml:space="preserve">Quilos sempre viram libras, em número redondo</w:t>
+      </w:r>
+      <w:r>
+        <w:t xml:space="preserve"> </w:t>
+      </w:r>
+      <w:r>
+        <w:t xml:space="preserve">(15 quilos → 30 pounds, nunca 33; 1 kg ≈ 2 lb na fala, arredondar para a dezena mais próxima). Na ração do touro é sempre</w:t>
+      </w:r>
+      <w:r>
+        <w:t xml:space="preserve"> </w:t>
+      </w:r>
+      <w:r>
+        <w:t xml:space="preserve">“</w:t>
+      </w:r>
+      <w:r>
+        <w:t xml:space="preserve">30 pounds</w:t>
+      </w:r>
+      <w:r>
+        <w:t xml:space="preserve">”</w:t>
+      </w:r>
+      <w:r>
+        <w:t xml:space="preserve">. Metros viram yards ou feet (200 metros → 200 yards; 15 metros → 50 feet). Minutos, horas e dias ficam. Decimais: 5,63 → 5.63; 8,46 → 8.46; 3,5 polegadas → 3.5 inches. Milhares: 3.000 → 3,000; 1.000 → 1,000. Horas: 6h04 → 6:04 a.m.; 4 da manhã → 4 in the morning / 4 a.m.; 7 da manhã → 7 a.m. Datas: 14 de janeiro → January 14th.</w:t>
       </w:r>
       <w:r>
         <w:t xml:space="preserve"> </w:t>

</xml_diff>

<commit_message>
Dinheiro com cifrão na frente em todas as traduções e regra no prompt
Co-Authored-By: Claude Fable 5.1 <noreply@anthropic.com>
Claude-Session: https://claude.ai/code/session_017HYp1xhSzB6Ui5hyJvLbGE
</commit_message>
<xml_diff>
--- a/analise-ed/PROMPT_Traducao_VSL_ED_EN-US.docx
+++ b/analise-ed/PROMPT_Traducao_VSL_ED_EN-US.docx
@@ -3297,7 +3297,170 @@
         <w:t xml:space="preserve"> </w:t>
       </w:r>
       <w:r>
-        <w:t xml:space="preserve">→ billion. Moeda: $ fica $.</w:t>
+        <w:t xml:space="preserve">→ billion.</w:t>
+      </w:r>
+      <w:r>
+        <w:t xml:space="preserve"> </w:t>
+      </w:r>
+      <w:r>
+        <w:rPr>
+          <w:bCs/>
+          <w:b/>
+        </w:rPr>
+        <w:t xml:space="preserve">Dinheiro sempre com cifrão na frente, nunca</w:t>
+      </w:r>
+      <w:r>
+        <w:rPr>
+          <w:bCs/>
+          <w:b/>
+        </w:rPr>
+        <w:t xml:space="preserve"> </w:t>
+      </w:r>
+      <w:r>
+        <w:rPr>
+          <w:bCs/>
+          <w:b/>
+        </w:rPr>
+        <w:t xml:space="preserve">“</w:t>
+      </w:r>
+      <w:r>
+        <w:rPr>
+          <w:bCs/>
+          <w:b/>
+        </w:rPr>
+        <w:t xml:space="preserve">dollars</w:t>
+      </w:r>
+      <w:r>
+        <w:rPr>
+          <w:bCs/>
+          <w:b/>
+        </w:rPr>
+        <w:t xml:space="preserve">”</w:t>
+      </w:r>
+      <w:r>
+        <w:rPr>
+          <w:bCs/>
+          <w:b/>
+        </w:rPr>
+        <w:t xml:space="preserve"> </w:t>
+      </w:r>
+      <w:r>
+        <w:rPr>
+          <w:bCs/>
+          <w:b/>
+        </w:rPr>
+        <w:t xml:space="preserve">por extenso depois do número</w:t>
+      </w:r>
+      <w:r>
+        <w:t xml:space="preserve">: 147 dólares → $147; 294 dólares → $294; 20, 30 milhões de dólares → $20, $30 million; 8,7 bilhões de dólares → $8.7 billion; 100.000 a 200.000 dólares → $100,000 to $200,000; 19 mil dólares → $19,000;</w:t>
+      </w:r>
+      <w:r>
+        <w:t xml:space="preserve"> </w:t>
+      </w:r>
+      <w:r>
+        <w:t xml:space="preserve">“</w:t>
+      </w:r>
+      <w:r>
+        <w:t xml:space="preserve">animal de 30 milhões</w:t>
+      </w:r>
+      <w:r>
+        <w:t xml:space="preserve">”</w:t>
+      </w:r>
+      <w:r>
+        <w:t xml:space="preserve"> </w:t>
+      </w:r>
+      <w:r>
+        <w:t xml:space="preserve">→ $30 million animal; cheque de 2 milhões → $2 million check. Exceções (fala, sem número exato):</w:t>
+      </w:r>
+      <w:r>
+        <w:t xml:space="preserve"> </w:t>
+      </w:r>
+      <w:r>
+        <w:t xml:space="preserve">“</w:t>
+      </w:r>
+      <w:r>
+        <w:t xml:space="preserve">menos de um dólar</w:t>
+      </w:r>
+      <w:r>
+        <w:t xml:space="preserve">”</w:t>
+      </w:r>
+      <w:r>
+        <w:t xml:space="preserve"> </w:t>
+      </w:r>
+      <w:r>
+        <w:t xml:space="preserve">→ under a dollar;</w:t>
+      </w:r>
+      <w:r>
+        <w:t xml:space="preserve"> </w:t>
+      </w:r>
+      <w:r>
+        <w:t xml:space="preserve">“</w:t>
+      </w:r>
+      <w:r>
+        <w:t xml:space="preserve">milhares de dólares</w:t>
+      </w:r>
+      <w:r>
+        <w:t xml:space="preserve">”</w:t>
+      </w:r>
+      <w:r>
+        <w:t xml:space="preserve"> </w:t>
+      </w:r>
+      <w:r>
+        <w:t xml:space="preserve">→ thousands of dollars;</w:t>
+      </w:r>
+      <w:r>
+        <w:t xml:space="preserve"> </w:t>
+      </w:r>
+      <w:r>
+        <w:t xml:space="preserve">“</w:t>
+      </w:r>
+      <w:r>
+        <w:t xml:space="preserve">trilhões de dólares</w:t>
+      </w:r>
+      <w:r>
+        <w:t xml:space="preserve">”</w:t>
+      </w:r>
+      <w:r>
+        <w:t xml:space="preserve"> </w:t>
+      </w:r>
+      <w:r>
+        <w:t xml:space="preserve">→ trillions of dollars;</w:t>
+      </w:r>
+      <w:r>
+        <w:t xml:space="preserve"> </w:t>
+      </w:r>
+      <w:r>
+        <w:t xml:space="preserve">“</w:t>
+      </w:r>
+      <w:r>
+        <w:t xml:space="preserve">esquema bilionário</w:t>
+      </w:r>
+      <w:r>
+        <w:t xml:space="preserve">”</w:t>
+      </w:r>
+      <w:r>
+        <w:t xml:space="preserve"> </w:t>
+      </w:r>
+      <w:r>
+        <w:t xml:space="preserve">→ billion-dollar scheme. Na boca do Mike,</w:t>
+      </w:r>
+      <w:r>
+        <w:t xml:space="preserve"> </w:t>
+      </w:r>
+      <w:r>
+        <w:t xml:space="preserve">“</w:t>
+      </w:r>
+      <w:r>
+        <w:t xml:space="preserve">5 mil / 15 mil</w:t>
+      </w:r>
+      <w:r>
+        <w:t xml:space="preserve">”</w:t>
+      </w:r>
+      <w:r>
+        <w:t xml:space="preserve"> </w:t>
+      </w:r>
+      <w:r>
+        <w:t xml:space="preserve">→ 5 grand / fifteen grand.</w:t>
       </w:r>
     </w:p>
     <w:bookmarkEnd w:id="34"/>

</xml_diff>